<commit_message>
ORCIDs and the corresponding-author addresses
The two ORCID iDs come from the Europe PMC record of the group's own EHJ
paper - the iDs the authors supplied at submission - and each was then
checked against its public ORCID record before being used.
0000-0002-9360-7332 resolves to Junbo Ge, Zhongshan Hospital Fudan
University, Director and Professor of Cardiology and Academician of the
Chinese Academy of Sciences; 0000-0003-0794-5907 resolves to Lingsen You
and lists the EHJ paper among its works. Li Shen has no ORCID, which is
fine: the field is optional.

Worth noting that a name search would have been useless here. Querying
ORCID for "Junbo Ge" returns 25 records and the correct one is not among
the first twenty, so the published-record route is not merely more
convenient than searching, it is the only reliable one.

Co-Authored-By: Claude Opus 5 <noreply@anthropic.com>
</commit_message>
<xml_diff>
--- a/preprint/Suitcordance_preprint.docx
+++ b/preprint/Suitcordance_preprint.docx
@@ -114,7 +114,12 @@
     </w:p>
     <w:p>
       <w:r>
-        <w:t>‡ Corresponding authors. Email: shen_li@fudan.edu.cn (L.S.); &amp;lt;GE_EMAIL&amp;gt; (J.G.).</w:t>
+        <w:t>‡ Corresponding authors. Email: jbge@zs-hospital.sh.cn (J.G.); shen_li@fudan.edu.cn (L.S.).</w:t>
+      </w:r>
+    </w:p>
+    <w:p>
+      <w:r>
+        <w:t>ORCID: L.Y. 0000-0003-0794-5907; J.G. 0000-0002-9360-7332.</w:t>
       </w:r>
     </w:p>
     <w:p>

</xml_diff>

<commit_message>
First author's institutional address
lingsenyou@fudan.edu.cn, in the manuscript and the submission form. Every
field in the package is now filled except the Zenodo DOI, which has to
exist before submission because section 9 promises it.

Co-Authored-By: Claude Opus 5 <noreply@anthropic.com>
</commit_message>
<xml_diff>
--- a/preprint/Suitcordance_preprint.docx
+++ b/preprint/Suitcordance_preprint.docx
@@ -119,7 +119,12 @@
     </w:p>
     <w:p>
       <w:r>
-        <w:t>ORCID: L.Y. 0000-0003-0794-5907; J.G. 0000-0002-9360-7332.</w:t>
+        <w:t>First author correspondence: lingsenyou@fudan.edu.cn (L.Y.).</w:t>
+      </w:r>
+    </w:p>
+    <w:p>
+      <w:r>
+        <w:t>ORCID: L.Y. 0000-0003-0794-5907; J.G. 0000-0002-9360-7332. L.S. has no ORCID.</w:t>
       </w:r>
     </w:p>
     <w:p>

</xml_diff>

<commit_message>
Record the DOI the release just minted
Zenodo archived v0.1.0 from the GitHub release. The concept DOI
10.5281/zenodo.22846540 always resolves to the latest version; v0.1.0 itself
is 10.5281/zenodo.22846541, built from 6aa1684.

Section 9 of the manuscript said the code was "archived under a Zenodo
concept DOI" without naming it, because it did not exist yet. It now names
both DOIs and the commit. CITATION.cff carries both as identifiers, README
carries the badge, and .zenodo.json gains the workbench as isDocumentedBy
for the next release.

The archived zipball is the tag's tree: 57 files, none of them the internal
review transcripts or operating notes, verified against the tag before the
release was published and again from the published record.

Co-Authored-By: Claude Opus 5 <noreply@anthropic.com>
</commit_message>
<xml_diff>
--- a/preprint/Suitcordance_preprint.docx
+++ b/preprint/Suitcordance_preprint.docx
@@ -2857,39 +2857,8 @@
       </w:r>
     </w:p>
     <w:p>
-      <w:pPr>
-        <w:ind w:left="432"/>
-      </w:pPr>
-      <w:r>
-        <w:rPr>
-          <w:color w:val="A8332A"/>
-          <w:sz w:val="19"/>
-        </w:rPr>
-        <w:t>The code, the anchor set with its provenance, the citation-audit record and the</w:t>
-      </w:r>
-    </w:p>
-    <w:p>
-      <w:pPr>
-        <w:ind w:left="432"/>
-      </w:pPr>
-      <w:r>
-        <w:rPr>
-          <w:color w:val="A8332A"/>
-          <w:sz w:val="19"/>
-        </w:rPr>
-        <w:t>scripts that regenerate every figure are archived under a Zenodo concept DOI, which</w:t>
-      </w:r>
-    </w:p>
-    <w:p>
-      <w:pPr>
-        <w:ind w:left="432"/>
-      </w:pPr>
-      <w:r>
-        <w:rPr>
-          <w:color w:val="A8332A"/>
-          <w:sz w:val="19"/>
-        </w:rPr>
-        <w:t>resolves to the latest version. The version described here is v0.1.0.</w:t>
+      <w:r>
+        <w:t>The code, the anchor set with its provenance, the citation-audit record and the scripts that regenerate every figure are archived at Zenodo under the concept DOI [10.5281/zenodo.22846540](https://doi.org/10.5281/zenodo.22846540), which always resolves to the latest version. The version described in this paper is v0.1.0, 10.5281/zenodo.22846541, built from commit 6aa1684 of https://github.com/lingsenyou/panvas-buddy.</w:t>
       </w:r>
     </w:p>
     <w:p>

</xml_diff>